<commit_message>
Configure 24/7 cloud deployment with Procfile, gunicorn, and dynamic port
</commit_message>
<xml_diff>
--- a/DOC/Belt Scale.docx
+++ b/DOC/Belt Scale.docx
@@ -1687,22 +1687,6 @@
           <w:b/>
           <w:sz w:val="22"/>
         </w:rPr>
-        <w:tab/>
-      </w:r>
-    </w:p>
-    <w:p>
-      <w:pPr>
-        <w:ind w:left="720" w:hanging="720"/>
-        <w:rPr>
-          <w:b/>
-          <w:sz w:val="22"/>
-        </w:rPr>
-      </w:pPr>
-      <w:r>
-        <w:rPr>
-          <w:b/>
-          <w:sz w:val="22"/>
-        </w:rPr>
         <w:t xml:space="preserve">Measurement to be </w:t>
       </w:r>
       <w:proofErr w:type="gramStart"/>
@@ -2777,10 +2761,9 @@
     <w:p/>
     <w:p>
       <w:r>
-        <w:t xml:space="preserve">  Instrument Used: </w:t>
+        <w:t xml:space="preserve">Instrument Used: </w:t>
       </w:r>
     </w:p>
-    <w:p/>
     <w:p>
       <w:pPr>
         <w:ind w:hanging="57"/>
@@ -2789,8 +2772,7 @@
         </w:rPr>
       </w:pPr>
       <w:r>
-        <w:lastRenderedPageBreak/>
-        <w:t xml:space="preserve">  Tested by:</w:t>
+        <w:t xml:space="preserve"> Tested by:</w:t>
       </w:r>
       <w:r>
         <w:t xml:space="preserve">                                </w:t>
@@ -2806,6 +2788,11 @@
       </w:r>
       <w:r>
         <w:tab/>
+      </w:r>
+      <w:r>
+        <w:t xml:space="preserve">                           </w:t>
+      </w:r>
+      <w:r>
         <w:t>Approved by:</w:t>
       </w:r>
     </w:p>
@@ -2821,7 +2808,7 @@
         </w:rPr>
       </w:pPr>
       <w:r>
-        <w:t xml:space="preserve"> Date:</w:t>
+        <w:t>Date:</w:t>
       </w:r>
       <w:r>
         <w:t xml:space="preserve">                            </w:t>
@@ -2840,7 +2827,20 @@
       </w:r>
       <w:r>
         <w:tab/>
-        <w:t>(HOD - PDN)</w:t>
+      </w:r>
+      <w:r>
+        <w:t xml:space="preserve">                        </w:t>
+      </w:r>
+      <w:proofErr w:type="gramStart"/>
+      <w:r>
+        <w:t xml:space="preserve">   </w:t>
+      </w:r>
+      <w:r>
+        <w:t>(</w:t>
+      </w:r>
+      <w:proofErr w:type="gramEnd"/>
+      <w:r>
+        <w:t>HOD - PDN)</w:t>
       </w:r>
     </w:p>
     <w:sectPr>

</xml_diff>